<commit_message>
Sharp white redesign + Archivo/Manrope fonts, hard corners; refresh social stats; updated resume (Yahoo, Sleep Timer, thinner margins)
Co-Authored-By: Claude Opus 4.7 <noreply@anthropic.com>
</commit_message>
<xml_diff>
--- a/Jax_Johnson_Resume_SocialMedia.docx
+++ b/Jax_Johnson_Resume_SocialMedia.docx
@@ -210,7 +210,7 @@
     <w:p>
       <w:pPr>
         <w:tabs>
-          <w:tab w:val="right" w:pos="11088"/>
+          <w:tab w:val="right" w:pos="11376"/>
         </w:tabs>
         <w:spacing w:after="6" w:before="44" w:line="234" w:lineRule="auto"/>
       </w:pPr>
@@ -238,7 +238,7 @@
     <w:p>
       <w:pPr>
         <w:tabs>
-          <w:tab w:val="right" w:pos="11088"/>
+          <w:tab w:val="right" w:pos="11376"/>
         </w:tabs>
         <w:spacing w:after="20" w:before="0" w:line="234" w:lineRule="auto"/>
       </w:pPr>
@@ -338,7 +338,7 @@
     <w:p>
       <w:pPr>
         <w:tabs>
-          <w:tab w:val="right" w:pos="11088"/>
+          <w:tab w:val="right" w:pos="11376"/>
         </w:tabs>
         <w:spacing w:after="6" w:before="44" w:line="234" w:lineRule="auto"/>
       </w:pPr>
@@ -366,7 +366,7 @@
     <w:p>
       <w:pPr>
         <w:tabs>
-          <w:tab w:val="right" w:pos="11088"/>
+          <w:tab w:val="right" w:pos="11376"/>
         </w:tabs>
         <w:spacing w:after="20" w:before="0" w:line="234" w:lineRule="auto"/>
       </w:pPr>
@@ -448,7 +448,7 @@
     <w:p>
       <w:pPr>
         <w:tabs>
-          <w:tab w:val="right" w:pos="11088"/>
+          <w:tab w:val="right" w:pos="11376"/>
         </w:tabs>
         <w:spacing w:after="6" w:before="44" w:line="234" w:lineRule="auto"/>
       </w:pPr>
@@ -476,7 +476,7 @@
     <w:p>
       <w:pPr>
         <w:tabs>
-          <w:tab w:val="right" w:pos="11088"/>
+          <w:tab w:val="right" w:pos="11376"/>
         </w:tabs>
         <w:spacing w:after="20" w:before="0" w:line="234" w:lineRule="auto"/>
       </w:pPr>
@@ -534,7 +534,7 @@
           <w:sz w:val="18"/>
           <w:szCs w:val="18"/>
         </w:rPr>
-        <w:t xml:space="preserve">Generated $15K+ in revenue through brand deals and a 3-month livestream campaign with partners including Gymshark, Suno, Snowverb, Dime Inc, Ailith AI, Recapture, and Locket</w:t>
+        <w:t xml:space="preserve">Generated $15K+ in revenue through brand deals and a 3-month livestream campaign with partners including Gymshark, Yahoo, Snowverb, Dime Inc, Ailith AI, Recapture, Locket, and Sleep Timer</w:t>
       </w:r>
     </w:p>
     <w:p>
@@ -576,7 +576,7 @@
     <w:p>
       <w:pPr>
         <w:tabs>
-          <w:tab w:val="right" w:pos="11088"/>
+          <w:tab w:val="right" w:pos="11376"/>
         </w:tabs>
         <w:spacing w:after="6" w:before="44" w:line="234" w:lineRule="auto"/>
       </w:pPr>
@@ -604,7 +604,7 @@
     <w:p>
       <w:pPr>
         <w:tabs>
-          <w:tab w:val="right" w:pos="11088"/>
+          <w:tab w:val="right" w:pos="11376"/>
         </w:tabs>
         <w:spacing w:after="20" w:before="0" w:line="234" w:lineRule="auto"/>
       </w:pPr>
@@ -668,7 +668,7 @@
     <w:p>
       <w:pPr>
         <w:tabs>
-          <w:tab w:val="right" w:pos="11088"/>
+          <w:tab w:val="right" w:pos="11376"/>
         </w:tabs>
         <w:spacing w:after="6" w:before="44" w:line="234" w:lineRule="auto"/>
       </w:pPr>
@@ -696,7 +696,7 @@
     <w:p>
       <w:pPr>
         <w:tabs>
-          <w:tab w:val="right" w:pos="11088"/>
+          <w:tab w:val="right" w:pos="11376"/>
         </w:tabs>
         <w:spacing w:after="20" w:before="0" w:line="234" w:lineRule="auto"/>
       </w:pPr>
@@ -778,7 +778,7 @@
     <w:p>
       <w:pPr>
         <w:tabs>
-          <w:tab w:val="right" w:pos="11088"/>
+          <w:tab w:val="right" w:pos="11376"/>
         </w:tabs>
         <w:spacing w:after="6" w:before="44" w:line="234" w:lineRule="auto"/>
       </w:pPr>
@@ -874,7 +874,7 @@
     </w:p>
     <w:sectPr>
       <w:pgSz w:w="11906" w:h="16838" w:orient="portrait"/>
-      <w:pgMar w:top="576" w:right="576" w:bottom="576" w:left="576" w:header="708" w:footer="708" w:gutter="0"/>
+      <w:pgMar w:top="432" w:right="432" w:bottom="432" w:left="432" w:header="708" w:footer="708" w:gutter="0"/>
       <w:pgNumType/>
       <w:docGrid w:linePitch="360"/>
     </w:sectPr>

</xml_diff>

<commit_message>
resume: remove rule under contact line, keep the spacing
Co-Authored-By: Claude Opus 4.7 <noreply@anthropic.com>
</commit_message>
<xml_diff>
--- a/Jax_Johnson_Resume_SocialMedia.docx
+++ b/Jax_Johnson_Resume_SocialMedia.docx
@@ -36,10 +36,7 @@
     </w:p>
     <w:p>
       <w:pPr>
-        <w:pBdr>
-          <w:bottom w:val="single" w:color="000000" w:sz="8"/>
-        </w:pBdr>
-        <w:spacing w:after="40"/>
+        <w:spacing w:after="120" w:before="0" w:line="234" w:lineRule="auto"/>
         <w:jc w:val="center"/>
       </w:pPr>
       <w:r>

</xml_diff>

<commit_message>
resume: uniform white space between all sections
Co-Authored-By: Claude Opus 4.7 <noreply@anthropic.com>
</commit_message>
<xml_diff>
--- a/Jax_Johnson_Resume_SocialMedia.docx
+++ b/Jax_Johnson_Resume_SocialMedia.docx
@@ -36,7 +36,7 @@
     </w:p>
     <w:p>
       <w:pPr>
-        <w:spacing w:after="120" w:before="0" w:line="234" w:lineRule="auto"/>
+        <w:spacing w:after="40" w:before="0" w:line="234" w:lineRule="auto"/>
         <w:jc w:val="center"/>
       </w:pPr>
       <w:r>
@@ -53,7 +53,7 @@
         <w:pBdr>
           <w:bottom w:val="single" w:color="000000" w:sz="8"/>
         </w:pBdr>
-        <w:spacing w:after="20" w:before="80" w:line="240" w:lineRule="auto"/>
+        <w:spacing w:after="20" w:before="200" w:line="240" w:lineRule="auto"/>
       </w:pPr>
       <w:r>
         <w:rPr>
@@ -84,7 +84,7 @@
         <w:pBdr>
           <w:bottom w:val="single" w:color="000000" w:sz="8"/>
         </w:pBdr>
-        <w:spacing w:after="20" w:before="80" w:line="240" w:lineRule="auto"/>
+        <w:spacing w:after="20" w:before="200" w:line="240" w:lineRule="auto"/>
       </w:pPr>
       <w:r>
         <w:rPr>
@@ -194,7 +194,7 @@
         <w:pBdr>
           <w:bottom w:val="single" w:color="000000" w:sz="8"/>
         </w:pBdr>
-        <w:spacing w:after="20" w:before="220" w:line="240" w:lineRule="auto"/>
+        <w:spacing w:after="20" w:before="200" w:line="240" w:lineRule="auto"/>
       </w:pPr>
       <w:r>
         <w:rPr>
@@ -762,7 +762,7 @@
         <w:pBdr>
           <w:bottom w:val="single" w:color="000000" w:sz="8"/>
         </w:pBdr>
-        <w:spacing w:after="20" w:before="80" w:line="240" w:lineRule="auto"/>
+        <w:spacing w:after="20" w:before="200" w:line="240" w:lineRule="auto"/>
       </w:pPr>
       <w:r>
         <w:rPr>
@@ -841,7 +841,7 @@
         <w:pBdr>
           <w:bottom w:val="single" w:color="000000" w:sz="8"/>
         </w:pBdr>
-        <w:spacing w:after="20" w:before="80" w:line="240" w:lineRule="auto"/>
+        <w:spacing w:after="20" w:before="200" w:line="240" w:lineRule="auto"/>
       </w:pPr>
       <w:r>
         <w:rPr>

</xml_diff>

<commit_message>
resume: bold right-side dates, italicize locations
Co-Authored-By: Claude Opus 4.7 <noreply@anthropic.com>
</commit_message>
<xml_diff>
--- a/Jax_Johnson_Resume_SocialMedia.docx
+++ b/Jax_Johnson_Resume_SocialMedia.docx
@@ -227,6 +227,8 @@
       <w:r>
         <w:rPr>
           <w:rFonts w:ascii="Arial" w:cs="Arial" w:eastAsia="Arial" w:hAnsi="Arial"/>
+          <w:b/>
+          <w:bCs/>
           <w:i/>
           <w:iCs/>
           <w:sz w:val="18"/>
@@ -355,6 +357,8 @@
       <w:r>
         <w:rPr>
           <w:rFonts w:ascii="Arial" w:cs="Arial" w:eastAsia="Arial" w:hAnsi="Arial"/>
+          <w:b/>
+          <w:bCs/>
           <w:i/>
           <w:iCs/>
           <w:sz w:val="18"/>
@@ -465,6 +469,8 @@
       <w:r>
         <w:rPr>
           <w:rFonts w:ascii="Arial" w:cs="Arial" w:eastAsia="Arial" w:hAnsi="Arial"/>
+          <w:b/>
+          <w:bCs/>
           <w:i/>
           <w:iCs/>
           <w:sz w:val="18"/>
@@ -593,6 +599,8 @@
       <w:r>
         <w:rPr>
           <w:rFonts w:ascii="Arial" w:cs="Arial" w:eastAsia="Arial" w:hAnsi="Arial"/>
+          <w:b/>
+          <w:bCs/>
           <w:i/>
           <w:iCs/>
           <w:sz w:val="18"/>
@@ -685,6 +693,8 @@
       <w:r>
         <w:rPr>
           <w:rFonts w:ascii="Arial" w:cs="Arial" w:eastAsia="Arial" w:hAnsi="Arial"/>
+          <w:b/>
+          <w:bCs/>
           <w:i/>
           <w:iCs/>
           <w:sz w:val="18"/>
@@ -795,6 +805,8 @@
       <w:r>
         <w:rPr>
           <w:rFonts w:ascii="Arial" w:cs="Arial" w:eastAsia="Arial" w:hAnsi="Arial"/>
+          <w:b/>
+          <w:bCs/>
           <w:i/>
           <w:iCs/>
           <w:sz w:val="18"/>

</xml_diff>

<commit_message>
resume: add Baylor filming/ideation bullet, add Yahoo! and BottleBuddy
Co-Authored-By: Claude Opus 4.7 <noreply@anthropic.com>
</commit_message>
<xml_diff>
--- a/Jax_Johnson_Resume_SocialMedia.docx
+++ b/Jax_Johnson_Resume_SocialMedia.docx
@@ -540,7 +540,7 @@
           <w:sz w:val="18"/>
           <w:szCs w:val="18"/>
         </w:rPr>
-        <w:t xml:space="preserve">Generated $15K+ in revenue through brand deals and a 3-month livestream campaign with partners including Gymshark, Yahoo, Snowverb, Dime Inc, Ailith AI, Recapture, Locket, and Sleep Timer</w:t>
+        <w:t xml:space="preserve">Generated $15K+ in revenue through brand deals and a 3-month livestream campaign with partners including Gymshark, Yahoo!, BottleBuddy, Snowverb, Dime Inc, Ailith AI, Recapture, Locket, and Sleep Timer</w:t>
       </w:r>
     </w:p>
     <w:p>
@@ -671,6 +671,24 @@
           <w:szCs w:val="18"/>
         </w:rPr>
         <w:t xml:space="preserve">Applied trend forecasting within university brand standards and collaborated with departments to capture major campus and athletics events</w:t>
+      </w:r>
+    </w:p>
+    <w:p>
+      <w:pPr>
+        <w:pStyle w:val="ListParagraph"/>
+        <w:numPr>
+          <w:ilvl w:val="0"/>
+          <w:numId w:val="2"/>
+        </w:numPr>
+        <w:spacing w:after="8" w:before="0" w:line="234" w:lineRule="auto"/>
+      </w:pPr>
+      <w:r>
+        <w:rPr>
+          <w:rFonts w:ascii="Arial" w:cs="Arial" w:eastAsia="Arial" w:hAnsi="Arial"/>
+          <w:sz w:val="18"/>
+          <w:szCs w:val="18"/>
+        </w:rPr>
+        <w:t xml:space="preserve">Filmed and edited roughly two videos per week and contributed content concepts in team brainstorms, helping shape the account's TikTok and Instagram calendar</w:t>
       </w:r>
     </w:p>
     <w:p>

</xml_diff>